<commit_message>
Actualizar definición del proyecto Fase 1
</commit_message>
<xml_diff>
--- a/Maipu/ALDO ALBERTO MARTINEZ ORDENES/006D/Equipo 09/Fase 1/Evidencias Grupales/1.5_GuiaEstudiante_Fase 1_Definicion Proyecto APT (Español).docx
+++ b/Maipu/ALDO ALBERTO MARTINEZ ORDENES/006D/Equipo 09/Fase 1/Evidencias Grupales/1.5_GuiaEstudiante_Fase 1_Definicion Proyecto APT (Español).docx
@@ -176,7 +176,7 @@
               </wp:anchor>
             </w:drawing>
           </mc:Choice>
-          <mc:Fallback xmlns:w16cei="http://schemas.microsoft.com/office/word/2026/wordml/cei">
+          <mc:Fallback>
             <w:pict>
               <v:group w14:anchorId="73EE8F4F" id="Grupo 1" o:spid="_x0000_s1026" style="position:absolute;margin-left:-34.3pt;margin-top:2.65pt;width:518.15pt;height:117.05pt;z-index:251658240" coordorigin="20557,30367" coordsize="65805,14865" o:gfxdata="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">
                 <v:group id="Grupo 1136909789" o:spid="_x0000_s1027" style="position:absolute;left:20557;top:30367;width:65805;height:14865" coordsize="59034,14868" o:gfxdata="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">
@@ -1221,7 +1221,7 @@
                 <w:sz w:val="20"/>
                 <w:szCs w:val="20"/>
               </w:rPr>
-              <w:t>Una dificultad frecuente entre las personas que realizan actividad física de manera autónoma es organizar rutinas que se ajusten a sus objetivos, nivel de experiencia, disponibilidad de tiempo y equipamiento. La información disponible en internet suele encontrarse dispersa y no siempre permite llevar un registro ordenado del entrenamiento, lo que puede provocar desorganización, poca continuidad o la utilización de rutinas que no se adaptan a las características del usuario.</w:t>
+              <w:t>Una dificultad frecuente entre las personas que realizan actividad física de manera autónoma es organizar rutinas que se ajusten a sus objetivos, nivel de experiencia y disponibilidad de tiempo. La información disponible en internet suele encontrarse dispersa y no siempre permite llevar un registro ordenado del entrenamiento, lo que puede provocar desorganización, poca continuidad o la utilización de rutinas que no se adaptan a las características del usuario.</w:t>
             </w:r>
             <w:r>
               <w:rPr>
@@ -1242,7 +1242,7 @@
                 <w:szCs w:val="20"/>
               </w:rPr>
               <w:br/>
-              <w:t>El proyecto busca abordar esta situación mediante una aplicación móvil dirigida a personas mayores de 18 años, de nivel principiante o intermedio, que deseen planificar y registrar principalmente rutinas de gimnasio. Debido a su carácter digital, podrá utilizarse desde diferentes ubicaciones y no dependerá de un gimnasio específico.</w:t>
+              <w:t>El proyecto busca abordar esta situación mediante una aplicación móvil dirigida a personas mayores de 18 años, de nivel principiante o intermedio, que deseen planificar y registrar principalmente rutinas de gimnasio. Debido a su carácter digital, podrá utilizarse en distintos gimnasios que cuenten con equipamiento estándar y no dependerá de un establecimiento específico.</w:t>
             </w:r>
             <w:r>
               <w:rPr>
@@ -1316,7 +1316,7 @@
                 <w:sz w:val="20"/>
                 <w:szCs w:val="20"/>
               </w:rPr>
-              <w:t>El proyecto consiste en desarrollar un prototipo funcional de aplicación móvil para la planificación y el seguimiento de rutinas de ejercicio personalizadas. Estará dirigido a personas mayores de 18 años que se identifiquen como principiantes o intermedias. La aplicación solicitará información como el objetivo del usuario —fuerza y acondicionamiento general, desarrollo muscular o resistencia muscular—, el nivel de experiencia, la cantidad de días disponibles, la duración estimada de las sesiones, el equipamiento, los grupos musculares prioritarios, las preferencias y los ejercicios que se deban evitar.</w:t>
+              <w:t xml:space="preserve">El proyecto consiste en desarrollar un prototipo funcional de aplicación móvil para la planificación y el seguimiento de rutinas de ejercicio personalizadas. Estará dirigido a personas mayores de 18 años que se identifiquen como principiantes o intermedias. La aplicación solicitará información como el objetivo del usuario —fuerza y acondicionamiento general, </w:t>
             </w:r>
             <w:r>
               <w:rPr>
@@ -1326,7 +1326,7 @@
                 <w:sz w:val="20"/>
                 <w:szCs w:val="20"/>
               </w:rPr>
-              <w:br/>
+              <w:t>desarrollo o resistencia musculares</w:t>
             </w:r>
             <w:r>
               <w:rPr>
@@ -1336,8 +1336,7 @@
                 <w:sz w:val="20"/>
                 <w:szCs w:val="20"/>
               </w:rPr>
-              <w:br/>
-              <w:t>A partir de estos antecedentes, el sistema generará una propuesta semanal mediante un mecanismo cuya alternativa definitiva se seleccionará después de evaluar la viabilidad de un enfoque determinista, uno basado en inteligencia artificial o uno híbrido. La generación utilizará un catálogo inicial dimensionado mediante una matriz de cobertura, con una hipótesis de entre 45 y 55 ejercicios, clasificados por grupo muscular principal, grupos secundarios cuando corresponda, patrón de movimiento y equipamiento. El catálogo considerará un gimnasio estándar: peso corporal, banco, mancuernas, barra y discos, rack, poleas y máquinas comunes. La rutina podrá incluir ejercicios, series, repeticiones y tiempos de descanso. El usuario también podrá registrar las sesiones realizadas, cargas utilizadas, percepción del esfuerzo y observaciones generales, además de consultar su historial de entrenamiento.</w:t>
+              <w:t>—, el nivel de experiencia, la cantidad de días disponibles, la duración estimada de las sesiones, los grupos musculares prioritarios, las preferencias y los ejercicios que se deban evitar. El producto mínimo viable asumirá que el usuario tiene acceso al equipamiento habitual de un gimnasio estándar, por lo que no incorporará perfiles independientes de equipamiento.</w:t>
             </w:r>
             <w:r>
               <w:rPr>
@@ -1358,6 +1357,37 @@
                 <w:szCs w:val="20"/>
               </w:rPr>
               <w:br/>
+              <w:t>A partir de estos antecedentes, el sistema generará una propuesta semanal mediante un mecanismo cuya alternativa definitiva se seleccionará después de evaluar la viabilidad de un enfoque determinista, uno basado en inteligencia artificial o uno híbrido. La generación utilizará un catálogo base de 32 ejercicios, compuesto por 29 ejercicios esenciales y 3 complementarios, dimensionado mediante una matriz de cobertura. Se podrán incorporar hasta 4 ejercicios condicionales únicamente si son necesarios para resolver brechas de cobertura, con un máximo de 36 ejercicios. Cada ejercicio se clasificará por grupo muscular principal, grupos secundarios cuando corresponda, patrón de movimiento y equipamiento. El catálogo considerará un gimnasio estándar: peso corporal, banco, mancuernas, barra y discos, rack, poleas y máquinas comunes. El equipamiento específico de cada ejercicio se conservará como dato de clasificación y visualización. La rutina podrá incluir ejercicios, series, repeticiones y tiempos de descanso. El usuario también podrá registrar las sesiones realizadas, cargas utilizadas, percepción del esfuerzo y observaciones generales, además de consultar su historial de entrenamiento.</w:t>
+            </w:r>
+            <w:r>
+              <w:rPr>
+                <w:i/>
+                <w:iCs/>
+                <w:color w:val="548DD4"/>
+                <w:sz w:val="20"/>
+                <w:szCs w:val="20"/>
+              </w:rPr>
+              <w:br/>
+            </w:r>
+            <w:r>
+              <w:rPr>
+                <w:i/>
+                <w:iCs/>
+                <w:color w:val="548DD4"/>
+                <w:sz w:val="20"/>
+                <w:szCs w:val="20"/>
+              </w:rPr>
+              <w:br/>
+            </w:r>
+            <w:r>
+              <w:rPr>
+                <w:i/>
+                <w:iCs/>
+                <w:color w:val="548DD4"/>
+                <w:sz w:val="20"/>
+                <w:szCs w:val="20"/>
+              </w:rPr>
+              <w:lastRenderedPageBreak/>
               <w:t>El alcance principal será un producto mínimo viable que incluya perfil de usuario, cuestionario inicial, catálogo de ejercicios, generación de rutinas, planificación semanal y registro de sesiones. La aplicación tendrá un propósito informativo y de organización del entrenamiento: permitirá indicar ejercicios que se deben evitar, pero no realizará diagnósticos, evaluación de lesiones, rehabilitación ni recomendaciones médicas.</w:t>
             </w:r>
           </w:p>
@@ -1652,7 +1682,6 @@
                 <w:szCs w:val="20"/>
               </w:rPr>
               <w:br/>
-              <w:t xml:space="preserve">Entre los principales riesgos se encuentran la carga de trabajo individual, posibles dificultades técnicas, la elección del enfoque de generación y la necesidad de revisar la coherencia de las rutinas propuestas. Estos riesgos se abordarán limitando las funciones complementarias, planificando metas semanales, realizando pruebas desde etapas tempranas y solicitando retroalimentación al docente y a </w:t>
             </w:r>
             <w:r>
               <w:rPr>
@@ -1662,28 +1691,8 @@
                 <w:sz w:val="20"/>
                 <w:szCs w:val="20"/>
               </w:rPr>
-              <w:t>un</w:t>
-            </w:r>
-            <w:r>
-              <w:rPr>
-                <w:i/>
-                <w:iCs/>
-                <w:color w:val="548DD4"/>
-                <w:sz w:val="20"/>
-                <w:szCs w:val="20"/>
-              </w:rPr>
-              <w:t xml:space="preserve"> preparador físico que participará como consultor externo para validar el catálogo y la coherencia de la </w:t>
-            </w:r>
-            <w:r>
-              <w:rPr>
-                <w:i/>
-                <w:iCs/>
-                <w:color w:val="548DD4"/>
-                <w:sz w:val="20"/>
-                <w:szCs w:val="20"/>
-              </w:rPr>
               <w:lastRenderedPageBreak/>
-              <w:t>lógica funcional. Las funciones adicionales, como notificaciones avanzadas o exportación de informes, solo se implementarán si el avance del producto mínimo viable lo permite.</w:t>
+              <w:t>Entre los principales riesgos se encuentran la carga de trabajo individual, posibles dificultades técnicas, la elección del enfoque de generación y la necesidad de revisar la cobertura del catálogo y la coherencia de las rutinas propuestas. Estos riesgos se abordarán limitando las funciones complementarias, planificando metas semanales, realizando pruebas desde etapas tempranas y solicitando retroalimentación al docente. Cuando surja una duda concreta sobre la clasificación de un ejercicio o la coherencia general de una combinación, se podrá realizar una consulta puntual a un preparador físico. Su participación se limitará a responder esas consultas específicas; la definición, implementación y validación funcional de la solución seguirán siendo responsabilidad de la estudiante. Las funciones adicionales, como notificaciones avanzadas o exportación de informes, solo se implementarán si el avance del producto mínimo viable lo permite.</w:t>
             </w:r>
           </w:p>
         </w:tc>
@@ -1901,7 +1910,7 @@
                 <w:sz w:val="20"/>
                 <w:szCs w:val="20"/>
               </w:rPr>
-              <w:t>Desarrollar y validar, durante un periodo de 18 semanas, un prototipo funcional de aplicación móvil que permita generar, planificar y registrar rutinas de ejercicio personalizadas de acuerdo con los objetivos, nivel de experiencia, disponibilidad y equipamiento del usuario.</w:t>
+              <w:t>Desarrollar y validar, durante un periodo de 18 semanas, un prototipo funcional de aplicación móvil que permita generar, planificar y registrar rutinas de ejercicio personalizadas de acuerdo con el objetivo, nivel de experiencia, disponibilidad y ejercicios que el usuario desee evitar, considerando el contexto de un gimnasio estándar.</w:t>
             </w:r>
           </w:p>
         </w:tc>
@@ -2007,7 +2016,7 @@
                 <w:sz w:val="20"/>
                 <w:szCs w:val="20"/>
               </w:rPr>
-              <w:t>3. Construir un catálogo inicial, dimensionado mediante una matriz de cobertura y con una hipótesis de entre 45 y 55 ejercicios, clasificados por grupo muscular principal, grupos musculares secundarios cuando corresponda, patrón de movimiento y equipamiento de gimnasio estándar.</w:t>
+              <w:t>3. Construir un catálogo base de 32 ejercicios —29 esenciales y 3 complementarios—, dimensionado mediante una matriz de cobertura y ampliable con hasta 4 ejercicios condicionales cuando sean necesarios, con un máximo de 36 ejercicios, clasificados por grupo muscular principal, grupos musculares secundarios cuando corresponda, patrón de movimiento y equipamiento de gimnasio estándar.</w:t>
             </w:r>
           </w:p>
           <w:p>
@@ -2029,7 +2038,7 @@
                 <w:sz w:val="20"/>
                 <w:szCs w:val="20"/>
               </w:rPr>
-              <w:t>4. Evaluar y definir un mecanismo viable —determinista, basado en inteligencia artificial o híbrido— e implementarlo para generar rutinas semanales de acuerdo con la información proporcionada por el usuario.</w:t>
+              <w:t>4. Evaluar y definir un mecanismo viable —determinista, basado en inteligencia artificial o híbrido— e implementarlo para generar rutinas semanales de acuerdo con el objetivo, nivel de experiencia, días disponibles, duración, prioridades, preferencias y ejercicios que el usuario desee evitar, considerando acceso a un gimnasio estándar.</w:t>
             </w:r>
           </w:p>
           <w:p>
@@ -2051,6 +2060,7 @@
                 <w:sz w:val="20"/>
                 <w:szCs w:val="20"/>
               </w:rPr>
+              <w:lastRenderedPageBreak/>
               <w:t>5. Implementar las funciones de planificación, registro de sesiones e historial de entrenamiento.</w:t>
             </w:r>
           </w:p>
@@ -2328,27 +2338,7 @@
                 <w:sz w:val="20"/>
                 <w:szCs w:val="20"/>
               </w:rPr>
-              <w:t xml:space="preserve">Durante la primera fase se realizará el levantamiento de información, la definición del problema, la delimitación del alcance, la identificación de usuarios y la especificación de requerimientos. También se diseñarán los flujos principales, el prototipo de interfaces y el modelo de datos, y se evaluarán la viabilidad técnica, la complejidad y los costos de las alternativas determinista, basada en inteligencia artificial e híbrida para la generación de rutinas. La propuesta funcional y el catálogo serán revisados con </w:t>
-            </w:r>
-            <w:r>
-              <w:rPr>
-                <w:i/>
-                <w:iCs/>
-                <w:color w:val="548DD4"/>
-                <w:sz w:val="20"/>
-                <w:szCs w:val="20"/>
-              </w:rPr>
-              <w:t>un</w:t>
-            </w:r>
-            <w:r>
-              <w:rPr>
-                <w:i/>
-                <w:iCs/>
-                <w:color w:val="548DD4"/>
-                <w:sz w:val="20"/>
-                <w:szCs w:val="20"/>
-              </w:rPr>
-              <w:t xml:space="preserve"> preparador físico que participará como consultor externo, con el fin de obtener observaciones sobre la coherencia de las rutinas y la clasificación de los ejercicios.</w:t>
+              <w:t>Durante la primera fase se realizará el levantamiento de información, la definición del problema, la delimitación del alcance, la identificación de usuarios y la especificación de requerimientos. También se diseñarán los flujos principales, el prototipo de interfaces y el modelo de datos, y se evaluarán la viabilidad técnica, la complejidad y los costos de las alternativas determinista, basada en inteligencia artificial e híbrida para la generación de rutinas. En puntos específicos del diseño se podrán formular consultas acotadas a un preparador físico cuando surjan dudas concretas sobre la clasificación de un ejercicio o la coherencia general de una combinación. Estas consultas constituirán un insumo complementario y no implicarán un rol permanente ni la validación integral del proyecto por parte del preparador físico.</w:t>
             </w:r>
           </w:p>
           <w:p>
@@ -2443,20 +2433,6 @@
           <w:szCs w:val="24"/>
         </w:rPr>
       </w:pPr>
-    </w:p>
-    <w:p>
-      <w:pPr>
-        <w:spacing w:after="0" w:line="240" w:lineRule="auto"/>
-        <w:rPr>
-          <w:b/>
-          <w:bCs/>
-          <w:sz w:val="24"/>
-          <w:szCs w:val="24"/>
-        </w:rPr>
-      </w:pPr>
-      <w:r>
-        <w:br w:type="page"/>
-      </w:r>
     </w:p>
     <w:tbl>
       <w:tblPr>
@@ -2497,6 +2473,10 @@
               </w:rPr>
             </w:pPr>
             <w:r>
+              <w:lastRenderedPageBreak/>
+              <w:br w:type="page"/>
+            </w:r>
+            <w:r>
               <w:rPr>
                 <w:b/>
                 <w:bCs/>
@@ -2504,7 +2484,6 @@
                 <w:sz w:val="28"/>
                 <w:szCs w:val="28"/>
               </w:rPr>
-              <w:lastRenderedPageBreak/>
               <w:t>6. Evidencias</w:t>
             </w:r>
           </w:p>
@@ -3538,7 +3517,21 @@
               <w:rPr>
                 <w:color w:val="1F3864"/>
               </w:rPr>
-              <w:t>En la siguiente tabla define la planificación de tu Proyecto APT de acuerdo a lo requerido.</w:t>
+              <w:t xml:space="preserve">En la siguiente tabla define la planificación de tu Proyecto APT </w:t>
+            </w:r>
+            <w:proofErr w:type="gramStart"/>
+            <w:r>
+              <w:rPr>
+                <w:color w:val="1F3864"/>
+              </w:rPr>
+              <w:t>de acuerdo a</w:t>
+            </w:r>
+            <w:proofErr w:type="gramEnd"/>
+            <w:r>
+              <w:rPr>
+                <w:color w:val="1F3864"/>
+              </w:rPr>
+              <w:t xml:space="preserve"> lo requerido.</w:t>
             </w:r>
           </w:p>
         </w:tc>
@@ -4092,7 +4085,7 @@
                 <w:sz w:val="18"/>
                 <w:szCs w:val="18"/>
               </w:rPr>
-              <w:t>Computador, herramienta de diseño y prototipado, herramienta de diagramación, documentación técnica y asesoría del consultor externo.</w:t>
+              <w:t>Computador, herramienta de diseño y prototipado, herramienta de diagramación, documentación técnica y asesoría del docente.</w:t>
             </w:r>
           </w:p>
         </w:tc>
@@ -4472,7 +4465,6 @@
                 <w:sz w:val="18"/>
                 <w:szCs w:val="18"/>
               </w:rPr>
-              <w:lastRenderedPageBreak/>
               <w:t>Modelamiento de datos; desarrollo de software.</w:t>
             </w:r>
           </w:p>
@@ -4527,7 +4519,7 @@
                 <w:sz w:val="18"/>
                 <w:szCs w:val="18"/>
               </w:rPr>
-              <w:t>Implementar el perfil del usuario, el cuestionario inicial y un catálogo de ejercicios dimensionado mediante una matriz de cobertura, con una hipótesis de entre 45 y 55 ejercicios. Cada ejercicio se clasificará por grupo muscular principal, grupos secundarios cuando corresponda, patrón de movimiento y equipamiento de gimnasio estándar.</w:t>
+              <w:t>Implementar el perfil del usuario, el cuestionario inicial y un catálogo base de 32 ejercicios, compuesto por 29 esenciales y 3 complementarios, dimensionado mediante una matriz de cobertura. Se podrán incorporar hasta 4 ejercicios condicionales si son necesarios para resolver brechas, con un máximo de 36. Cada ejercicio se clasificará por grupo muscular principal, grupos secundarios cuando corresponda, patrón de movimiento y equipamiento de gimnasio estándar.</w:t>
             </w:r>
           </w:p>
         </w:tc>
@@ -4554,7 +4546,7 @@
                 <w:sz w:val="18"/>
                 <w:szCs w:val="18"/>
               </w:rPr>
-              <w:t>Entorno de desarrollo, base de datos, teléfono o emulador, documentación técnica y orientación del consultor externo.</w:t>
+              <w:t>Entorno de desarrollo, base de datos, teléfono o emulador, documentación técnica, fuentes especializadas y consulta puntual a un preparador físico si surge una duda específica.</w:t>
             </w:r>
           </w:p>
         </w:tc>
@@ -4642,7 +4634,7 @@
                 <w:sz w:val="18"/>
                 <w:szCs w:val="18"/>
               </w:rPr>
-              <w:t>Facilitador: apoyo de Sebastián Guerra para validar el catálogo y su cobertura. Obstáculo: cantidad y calidad de la información necesaria. Mitigación: utilizar una matriz de cobertura y mantener como hipótesis inicial un catálogo de entre 45 y 55 ejercicios.</w:t>
+              <w:t>Facilitador: matriz de cobertura previamente definida. Obstáculo: cantidad y calidad de la información necesaria. Mitigación: mantener un catálogo base de 32 ejercicios y añadir hasta 4 ejercicios condicionales únicamente si la matriz evidencia brechas de cobertura, sin superar un total de 36.</w:t>
             </w:r>
           </w:p>
         </w:tc>
@@ -4728,7 +4720,7 @@
                 <w:sz w:val="18"/>
                 <w:szCs w:val="18"/>
               </w:rPr>
-              <w:t xml:space="preserve">Evaluar la viabilidad de un enfoque determinista, uno basado en inteligencia artificial o uno híbrido; seleccionar la alternativa compatible con el alcance y luego implementar el mecanismo de generación según objetivo, nivel, días disponibles, duración, equipamiento, </w:t>
+              <w:t xml:space="preserve">Evaluar la viabilidad de un enfoque determinista, uno basado en inteligencia artificial o uno híbrido; seleccionar la alternativa compatible con el </w:t>
             </w:r>
             <w:r>
               <w:rPr>
@@ -4739,7 +4731,7 @@
                 <w:szCs w:val="18"/>
               </w:rPr>
               <w:lastRenderedPageBreak/>
-              <w:t>preferencias y ejercicios a evitar.</w:t>
+              <w:t>alcance y luego implementar el mecanismo de generación según objetivo, nivel, días disponibles, duración, prioridades, preferencias y ejercicios a evitar, considerando acceso a un gimnasio estándar.</w:t>
             </w:r>
           </w:p>
         </w:tc>
@@ -4767,7 +4759,18 @@
                 <w:szCs w:val="18"/>
               </w:rPr>
               <w:lastRenderedPageBreak/>
-              <w:t>Entorno de desarrollo, catálogo de ejercicios, repositorio de código, documentación de la lógica seleccionada, análisis de costos y asesoría de Sebastián Guerra.</w:t>
+              <w:t xml:space="preserve">Entorno de desarrollo, catálogo de ejercicios, repositorio de código, documentación de la lógica seleccionada, </w:t>
+            </w:r>
+            <w:r>
+              <w:rPr>
+                <w:i/>
+                <w:iCs/>
+                <w:color w:val="548DD4"/>
+                <w:sz w:val="18"/>
+                <w:szCs w:val="18"/>
+              </w:rPr>
+              <w:lastRenderedPageBreak/>
+              <w:t>análisis de costos y casos de prueba.</w:t>
             </w:r>
           </w:p>
         </w:tc>
@@ -4797,6 +4800,7 @@
                 <w:sz w:val="18"/>
                 <w:szCs w:val="18"/>
               </w:rPr>
+              <w:lastRenderedPageBreak/>
               <w:t>Semanas 7 a 10 (4 semanas).</w:t>
             </w:r>
           </w:p>
@@ -4855,7 +4859,7 @@
                 <w:sz w:val="18"/>
                 <w:szCs w:val="18"/>
               </w:rPr>
-              <w:t xml:space="preserve">Facilitador: revisión de la lógica con Sebastián Guerra. Obstáculo: elegir un enfoque demasiado complejo o generar combinaciones incoherentes. Mitigación: comparar viabilidad y costos, documentar la lógica seleccionada, limitar las combinaciones </w:t>
+              <w:t xml:space="preserve">Facilitador: requerimientos documentados, matriz de cobertura y casos de prueba. Obstáculo: elegir un enfoque demasiado complejo o generar </w:t>
             </w:r>
             <w:r>
               <w:rPr>
@@ -4866,7 +4870,7 @@
                 <w:szCs w:val="18"/>
               </w:rPr>
               <w:lastRenderedPageBreak/>
-              <w:t>iniciales y elaborar casos de prueba. Hito: evaluación de avance en la semana 10.</w:t>
+              <w:t>combinaciones incoherentes. Mitigación: comparar viabilidad y costos, documentar la lógica seleccionada, limitar las combinaciones iniciales y elaborar casos de prueba. Hito: evaluación de avance en la semana 10.</w:t>
             </w:r>
           </w:p>
         </w:tc>
@@ -4898,7 +4902,6 @@
                 <w:sz w:val="18"/>
                 <w:szCs w:val="18"/>
               </w:rPr>
-              <w:lastRenderedPageBreak/>
               <w:t>Modelamiento de datos; desarrollo de software.</w:t>
             </w:r>
           </w:p>
@@ -5181,7 +5184,7 @@
                 <w:sz w:val="18"/>
                 <w:szCs w:val="18"/>
               </w:rPr>
-              <w:t>Dispositivos o emuladores, casos de prueba, repositorio de código, retroalimentación de usuarios de prueba, docente y consultor.</w:t>
+              <w:t>Dispositivos o emuladores, casos de prueba, repositorio de código, retroalimentación de usuarios de prueba y docente.</w:t>
             </w:r>
           </w:p>
         </w:tc>
@@ -5355,7 +5358,18 @@
                 <w:sz w:val="18"/>
                 <w:szCs w:val="18"/>
               </w:rPr>
-              <w:t>Recopilar las evidencias, elaborar la documentación técnica y el manual de usuario, preparar una versión funcional del prototipo y presentar los resultados del desarrollo.</w:t>
+              <w:t xml:space="preserve">Recopilar las evidencias, elaborar la documentación técnica y el manual de usuario, preparar una versión funcional del </w:t>
+            </w:r>
+            <w:r>
+              <w:rPr>
+                <w:i/>
+                <w:iCs/>
+                <w:color w:val="548DD4"/>
+                <w:sz w:val="18"/>
+                <w:szCs w:val="18"/>
+              </w:rPr>
+              <w:lastRenderedPageBreak/>
+              <w:t>prototipo y presentar los resultados del desarrollo.</w:t>
             </w:r>
           </w:p>
         </w:tc>
@@ -5382,7 +5396,19 @@
                 <w:sz w:val="18"/>
                 <w:szCs w:val="18"/>
               </w:rPr>
-              <w:t>Herramientas de documentación y presentación, capturas de la aplicación, repositorio de código, dispositivo de prueba y resultados de las pruebas.</w:t>
+              <w:lastRenderedPageBreak/>
+              <w:t xml:space="preserve">Herramientas de documentación y presentación, capturas de la aplicación, repositorio de código, dispositivo de prueba y </w:t>
+            </w:r>
+            <w:r>
+              <w:rPr>
+                <w:i/>
+                <w:iCs/>
+                <w:color w:val="548DD4"/>
+                <w:sz w:val="18"/>
+                <w:szCs w:val="18"/>
+              </w:rPr>
+              <w:lastRenderedPageBreak/>
+              <w:t>resultados de las pruebas.</w:t>
             </w:r>
           </w:p>
         </w:tc>
@@ -5412,6 +5438,7 @@
                 <w:sz w:val="18"/>
                 <w:szCs w:val="18"/>
               </w:rPr>
+              <w:lastRenderedPageBreak/>
               <w:t>Semanas 12 a 15 (4 semanas).</w:t>
             </w:r>
           </w:p>
@@ -5470,7 +5497,18 @@
                 <w:sz w:val="18"/>
                 <w:szCs w:val="18"/>
               </w:rPr>
-              <w:t>Facilitador: recopilación progresiva de evidencias. Obstáculo: acumulación de documentación al finalizar el desarrollo. Mitigación: actualizar las evidencias y documentos cada semana. Hito: entrega y presentación de resultados en la semana 15.</w:t>
+              <w:t xml:space="preserve">Facilitador: recopilación progresiva de evidencias. Obstáculo: acumulación de documentación al finalizar el desarrollo. </w:t>
+            </w:r>
+            <w:r>
+              <w:rPr>
+                <w:i/>
+                <w:iCs/>
+                <w:color w:val="548DD4"/>
+                <w:sz w:val="18"/>
+                <w:szCs w:val="18"/>
+              </w:rPr>
+              <w:lastRenderedPageBreak/>
+              <w:t>Mitigación: actualizar las evidencias y documentos cada semana. Hito: entrega y presentación de resultados en la semana 15.</w:t>
             </w:r>
           </w:p>
         </w:tc>
@@ -5502,7 +5540,6 @@
                 <w:sz w:val="18"/>
                 <w:szCs w:val="18"/>
               </w:rPr>
-              <w:lastRenderedPageBreak/>
               <w:t>Gestión de proyectos; desarrollo de software; pruebas de calidad.</w:t>
             </w:r>
           </w:p>
@@ -5678,6 +5715,150 @@
         </w:tc>
       </w:tr>
     </w:tbl>
+    <w:p>
+      <w:pPr>
+        <w:spacing w:after="0" w:line="360" w:lineRule="auto"/>
+        <w:jc w:val="both"/>
+        <w:rPr>
+          <w:b/>
+          <w:bCs/>
+          <w:sz w:val="24"/>
+          <w:szCs w:val="24"/>
+        </w:rPr>
+      </w:pPr>
+    </w:p>
+    <w:p>
+      <w:pPr>
+        <w:spacing w:after="0" w:line="360" w:lineRule="auto"/>
+        <w:jc w:val="both"/>
+        <w:rPr>
+          <w:b/>
+          <w:bCs/>
+          <w:sz w:val="24"/>
+          <w:szCs w:val="24"/>
+        </w:rPr>
+      </w:pPr>
+    </w:p>
+    <w:p>
+      <w:pPr>
+        <w:spacing w:after="0" w:line="360" w:lineRule="auto"/>
+        <w:jc w:val="both"/>
+        <w:rPr>
+          <w:b/>
+          <w:bCs/>
+          <w:sz w:val="24"/>
+          <w:szCs w:val="24"/>
+        </w:rPr>
+      </w:pPr>
+    </w:p>
+    <w:p>
+      <w:pPr>
+        <w:spacing w:after="0" w:line="360" w:lineRule="auto"/>
+        <w:jc w:val="both"/>
+        <w:rPr>
+          <w:b/>
+          <w:bCs/>
+          <w:sz w:val="24"/>
+          <w:szCs w:val="24"/>
+        </w:rPr>
+      </w:pPr>
+    </w:p>
+    <w:p>
+      <w:pPr>
+        <w:spacing w:after="0" w:line="360" w:lineRule="auto"/>
+        <w:jc w:val="both"/>
+        <w:rPr>
+          <w:b/>
+          <w:bCs/>
+          <w:sz w:val="24"/>
+          <w:szCs w:val="24"/>
+        </w:rPr>
+      </w:pPr>
+    </w:p>
+    <w:p>
+      <w:pPr>
+        <w:spacing w:after="0" w:line="360" w:lineRule="auto"/>
+        <w:jc w:val="both"/>
+        <w:rPr>
+          <w:b/>
+          <w:bCs/>
+          <w:sz w:val="24"/>
+          <w:szCs w:val="24"/>
+        </w:rPr>
+      </w:pPr>
+    </w:p>
+    <w:p>
+      <w:pPr>
+        <w:spacing w:after="0" w:line="360" w:lineRule="auto"/>
+        <w:jc w:val="both"/>
+        <w:rPr>
+          <w:b/>
+          <w:bCs/>
+          <w:sz w:val="24"/>
+          <w:szCs w:val="24"/>
+        </w:rPr>
+      </w:pPr>
+    </w:p>
+    <w:p>
+      <w:pPr>
+        <w:spacing w:after="0" w:line="360" w:lineRule="auto"/>
+        <w:jc w:val="both"/>
+        <w:rPr>
+          <w:b/>
+          <w:bCs/>
+          <w:sz w:val="24"/>
+          <w:szCs w:val="24"/>
+        </w:rPr>
+      </w:pPr>
+    </w:p>
+    <w:p>
+      <w:pPr>
+        <w:spacing w:after="0" w:line="360" w:lineRule="auto"/>
+        <w:jc w:val="both"/>
+        <w:rPr>
+          <w:b/>
+          <w:bCs/>
+          <w:sz w:val="24"/>
+          <w:szCs w:val="24"/>
+        </w:rPr>
+      </w:pPr>
+    </w:p>
+    <w:p>
+      <w:pPr>
+        <w:spacing w:after="0" w:line="360" w:lineRule="auto"/>
+        <w:jc w:val="both"/>
+        <w:rPr>
+          <w:b/>
+          <w:bCs/>
+          <w:sz w:val="24"/>
+          <w:szCs w:val="24"/>
+        </w:rPr>
+      </w:pPr>
+    </w:p>
+    <w:p>
+      <w:pPr>
+        <w:spacing w:after="0" w:line="360" w:lineRule="auto"/>
+        <w:jc w:val="both"/>
+        <w:rPr>
+          <w:b/>
+          <w:bCs/>
+          <w:sz w:val="24"/>
+          <w:szCs w:val="24"/>
+        </w:rPr>
+      </w:pPr>
+    </w:p>
+    <w:p>
+      <w:pPr>
+        <w:spacing w:after="0" w:line="360" w:lineRule="auto"/>
+        <w:jc w:val="both"/>
+        <w:rPr>
+          <w:b/>
+          <w:bCs/>
+          <w:sz w:val="24"/>
+          <w:szCs w:val="24"/>
+        </w:rPr>
+      </w:pPr>
+    </w:p>
     <w:p>
       <w:pPr>
         <w:spacing w:after="0" w:line="360" w:lineRule="auto"/>
@@ -5736,6 +5917,7 @@
                 <w:sz w:val="28"/>
                 <w:szCs w:val="28"/>
               </w:rPr>
+              <w:lastRenderedPageBreak/>
               <w:t xml:space="preserve">8. Carta Gantt </w:t>
             </w:r>
           </w:p>
@@ -5836,12 +6018,10 @@
         <w:gridCol w:w="523"/>
         <w:gridCol w:w="525"/>
         <w:gridCol w:w="525"/>
-        <w:gridCol w:w="525"/>
-        <w:gridCol w:w="7"/>
-        <w:gridCol w:w="518"/>
+        <w:gridCol w:w="532"/>
         <w:gridCol w:w="525"/>
         <w:gridCol w:w="525"/>
-        <w:gridCol w:w="10"/>
+        <w:gridCol w:w="528"/>
       </w:tblGrid>
       <w:tr>
         <w:trPr>
@@ -5905,7 +6085,7 @@
         <w:tc>
           <w:tcPr>
             <w:tcW w:w="5766" w:type="dxa"/>
-            <w:gridSpan w:val="12"/>
+            <w:gridSpan w:val="11"/>
             <w:shd w:val="clear" w:color="auto" w:fill="FFF2CB"/>
           </w:tcPr>
           <w:p>
@@ -5933,7 +6113,7 @@
         <w:tc>
           <w:tcPr>
             <w:tcW w:w="1578" w:type="dxa"/>
-            <w:gridSpan w:val="4"/>
+            <w:gridSpan w:val="3"/>
             <w:shd w:val="clear" w:color="auto" w:fill="FBE4D5"/>
           </w:tcPr>
           <w:p>
@@ -5961,8 +6141,6 @@
       </w:tr>
       <w:tr>
         <w:trPr>
-          <w:gridAfter w:val="1"/>
-          <w:wAfter w:w="10" w:type="dxa"/>
           <w:trHeight w:val="303"/>
         </w:trPr>
         <w:tc>
@@ -6383,7 +6561,6 @@
         <w:tc>
           <w:tcPr>
             <w:tcW w:w="525" w:type="dxa"/>
-            <w:gridSpan w:val="2"/>
           </w:tcPr>
           <w:p>
             <w:pPr>
@@ -6462,8 +6639,6 @@
       </w:tr>
       <w:tr>
         <w:trPr>
-          <w:gridAfter w:val="1"/>
-          <w:wAfter w:w="10" w:type="dxa"/>
           <w:trHeight w:val="294"/>
         </w:trPr>
         <w:tc>
@@ -6777,7 +6952,6 @@
         <w:tc>
           <w:tcPr>
             <w:tcW w:w="525" w:type="dxa"/>
-            <w:gridSpan w:val="2"/>
           </w:tcPr>
           <w:p>
             <w:pPr>
@@ -6829,8 +7003,6 @@
       </w:tr>
       <w:tr>
         <w:trPr>
-          <w:gridAfter w:val="1"/>
-          <w:wAfter w:w="10" w:type="dxa"/>
           <w:trHeight w:val="303"/>
         </w:trPr>
         <w:tc>
@@ -7144,7 +7316,6 @@
         <w:tc>
           <w:tcPr>
             <w:tcW w:w="525" w:type="dxa"/>
-            <w:gridSpan w:val="2"/>
           </w:tcPr>
           <w:p>
             <w:pPr>
@@ -7196,8 +7367,6 @@
       </w:tr>
       <w:tr>
         <w:trPr>
-          <w:gridAfter w:val="1"/>
-          <w:wAfter w:w="10" w:type="dxa"/>
           <w:trHeight w:val="294"/>
         </w:trPr>
         <w:tc>
@@ -7502,7 +7671,6 @@
         <w:tc>
           <w:tcPr>
             <w:tcW w:w="525" w:type="dxa"/>
-            <w:gridSpan w:val="2"/>
           </w:tcPr>
           <w:p>
             <w:pPr>
@@ -7554,8 +7722,6 @@
       </w:tr>
       <w:tr>
         <w:trPr>
-          <w:gridAfter w:val="1"/>
-          <w:wAfter w:w="10" w:type="dxa"/>
           <w:trHeight w:val="294"/>
         </w:trPr>
         <w:tc>
@@ -7580,7 +7746,6 @@
                 <w:sz w:val="16"/>
                 <w:szCs w:val="16"/>
               </w:rPr>
-              <w:lastRenderedPageBreak/>
               <w:t>Implementación del perfil y catálogo de ejercicios</w:t>
             </w:r>
           </w:p>
@@ -7870,7 +8035,6 @@
         <w:tc>
           <w:tcPr>
             <w:tcW w:w="525" w:type="dxa"/>
-            <w:gridSpan w:val="2"/>
           </w:tcPr>
           <w:p>
             <w:pPr>
@@ -7922,8 +8086,6 @@
       </w:tr>
       <w:tr>
         <w:trPr>
-          <w:gridAfter w:val="1"/>
-          <w:wAfter w:w="10" w:type="dxa"/>
           <w:trHeight w:val="294"/>
         </w:trPr>
         <w:tc>
@@ -8246,7 +8408,6 @@
         <w:tc>
           <w:tcPr>
             <w:tcW w:w="525" w:type="dxa"/>
-            <w:gridSpan w:val="2"/>
           </w:tcPr>
           <w:p>
             <w:pPr>
@@ -8298,8 +8459,6 @@
       </w:tr>
       <w:tr>
         <w:trPr>
-          <w:gridAfter w:val="1"/>
-          <w:wAfter w:w="10" w:type="dxa"/>
           <w:trHeight w:val="294"/>
         </w:trPr>
         <w:tc>
@@ -8622,7 +8781,6 @@
         <w:tc>
           <w:tcPr>
             <w:tcW w:w="525" w:type="dxa"/>
-            <w:gridSpan w:val="2"/>
           </w:tcPr>
           <w:p>
             <w:pPr>
@@ -8674,8 +8832,6 @@
       </w:tr>
       <w:tr>
         <w:trPr>
-          <w:gridAfter w:val="1"/>
-          <w:wAfter w:w="10" w:type="dxa"/>
           <w:trHeight w:val="294"/>
         </w:trPr>
         <w:tc>
@@ -9007,7 +9163,6 @@
         <w:tc>
           <w:tcPr>
             <w:tcW w:w="525" w:type="dxa"/>
-            <w:gridSpan w:val="2"/>
           </w:tcPr>
           <w:p>
             <w:pPr>
@@ -9059,8 +9214,6 @@
       </w:tr>
       <w:tr>
         <w:trPr>
-          <w:gridAfter w:val="1"/>
-          <w:wAfter w:w="10" w:type="dxa"/>
           <w:trHeight w:val="294"/>
         </w:trPr>
         <w:tc>
@@ -9085,6 +9238,7 @@
                 <w:sz w:val="16"/>
                 <w:szCs w:val="16"/>
               </w:rPr>
+              <w:lastRenderedPageBreak/>
               <w:t>Documentación y entrega final de la Fase 2</w:t>
             </w:r>
           </w:p>
@@ -9383,7 +9537,6 @@
         <w:tc>
           <w:tcPr>
             <w:tcW w:w="525" w:type="dxa"/>
-            <w:gridSpan w:val="2"/>
           </w:tcPr>
           <w:p>
             <w:pPr>
@@ -9435,8 +9588,6 @@
       </w:tr>
       <w:tr>
         <w:trPr>
-          <w:gridAfter w:val="1"/>
-          <w:wAfter w:w="10" w:type="dxa"/>
           <w:trHeight w:val="294"/>
         </w:trPr>
         <w:tc>
@@ -9723,7 +9874,6 @@
         <w:tc>
           <w:tcPr>
             <w:tcW w:w="525" w:type="dxa"/>
-            <w:gridSpan w:val="2"/>
           </w:tcPr>
           <w:p>
             <w:pPr>

</xml_diff>